<commit_message>
Job 2nd re-audit: 1 MSG omission restored (EN/KO), GDocs 42/42 verified
</commit_message>
<xml_diff>
--- a/gdocs_build/Job.docx
+++ b/gdocs_build/Job.docx
@@ -20569,7 +20569,7 @@
               <w:rPr>
                 <w:sz w:val="18"/>
               </w:rPr>
-              <w:t>Job answered God: "Okay, I'm 100% sold. You can do literally anything. No one can mess with your plans. You were like, ‘Who’s this guy muddying the water, confusing everything when he doesn’t know what he’s talking about?’ And yeah, that was me. I was just running my mouth about stuff that was way too deep for me, talking about miracles like it was no big deal. You told me, ‘Yo, listen up, it’s my turn to talk. I’ll ask the questions, you answer.’ And for real, I used to just hear about you, like gossip. But now I’ve seen you with my own eyes and heard you with my own ears. It's real. My bad, for real. Forgive me. I’m never doing that again, I swear. No more living off of what other people say."</w:t>
+              <w:t>Job answered God: "Okay, I'm 100% sold. You can do literally anything. No one can mess with your plans. You were like, ‘Who’s this guy muddying the water, confusing everything when he doesn’t even know what he’s talking about—and second-guessing my plans?’ And yeah, that was me. I was just running my mouth about stuff that was way too deep for me, talking about miracles like it was no big deal. You told me, ‘Yo, listen up, it’s my turn to talk. I’ll ask the questions, you answer.’ And for real, I used to just hear about you, like gossip. But now I’ve seen you with my own eyes and heard you with my own ears. It's real. My bad, for real. Forgive me. I’m never doing that again, I swear. No more living off of what other people say."</w:t>
             </w:r>
           </w:p>
         </w:tc>
@@ -20592,7 +20592,7 @@
               <w:rPr>
                 <w:sz w:val="18"/>
               </w:rPr>
-              <w:t>욥이 하나님한테 대답했대. "와, 이제 확실히 알겠어요. 하나님은 진짜 모든 걸 다 하실 수 있는 분이고, 아무도 하나님의 계획을 망칠 수 없다는 걸요. 하나님이 ‘이게 누구냐, 잘 알지도 못하면서 내 계획을 흐리고 아는 척하는 게’라고 물으셨잖아요? 인정. 그게 바로 저였어요. 제가 제 수준을 넘어서는 것들에 대해 막 떠들어댔고, 제가 감당도 못 할 엄청난 기적들에 대해 아무렇지 않게 말했어요. 하나님이 저한테 ‘야, 들어봐. 이제 내가 말할 테니. 내가 질문할게. 너는 대답이나 해.’라고 하셨죠. 솔직히 전에는 하나님에 대해 소문으로만 들었거든요. 근데 이제는 직접 제 눈으로 보고 귀로 들었어요! 진짜였어요. 제가 잘못했어요, 용서해주세요. 다시는 안 그럴게요, 진짜로! 다시는 뜬소문이나 듣고 살지 않을 거예요."</w:t>
+              <w:t>욥이 하나님한테 대답했대. "와, 이제 확실히 알겠어요. 하나님은 진짜 모든 걸 다 하실 수 있는 분이고, 아무도 하나님의 계획을 망칠 수 없다는 걸요. 하나님이 ‘이게 누구냐, 잘 알지도 못하면서 내 계획을 흐리고 아는 척하고 내 뜻을 의심하는 게’라고 물으셨잖아요? 인정. 그게 바로 저였어요. 제가 제 수준을 넘어서는 것들에 대해 막 떠들어댔고, 제가 감당도 못 할 엄청난 기적들에 대해 아무렇지 않게 말했어요. 하나님이 저한테 ‘야, 들어봐. 이제 내가 말할 테니. 내가 질문할게. 너는 대답이나 해.’라고 하셨죠. 솔직히 전에는 하나님에 대해 소문으로만 들었거든요. 근데 이제는 직접 제 눈으로 보고 귀로 들었어요! 진짜였어요. 제가 잘못했어요, 용서해주세요. 다시는 안 그럴게요, 진짜로! 다시는 뜬소문이나 듣고 살지 않을 거예요."</w:t>
             </w:r>
           </w:p>
         </w:tc>

</xml_diff>

<commit_message>
Job 배지 정밀화 (OT 전수조사): 33곳 (EN+KO) — 중복 배지 좁힘 13건 + 분할 경계 off-by-one 20건. 독스 42/42 export-back OK.
</commit_message>
<xml_diff>
--- a/gdocs_build/Job.docx
+++ b/gdocs_build/Job.docx
@@ -314,7 +314,7 @@
                 <w:b/>
                 <w:sz w:val="16"/>
               </w:rPr>
-              <w:t>6-7</w:t>
+              <w:t>7</w:t>
             </w:r>
           </w:p>
           <w:p>
@@ -337,7 +337,7 @@
                 <w:b/>
                 <w:sz w:val="16"/>
               </w:rPr>
-              <w:t>6-7</w:t>
+              <w:t>7</w:t>
             </w:r>
           </w:p>
           <w:p>
@@ -360,7 +360,7 @@
                 <w:b/>
                 <w:sz w:val="16"/>
               </w:rPr>
-              <w:t>6-7</w:t>
+              <w:t>7</w:t>
             </w:r>
           </w:p>
           <w:p>
@@ -1233,7 +1233,7 @@
                 <w:b/>
                 <w:sz w:val="16"/>
               </w:rPr>
-              <w:t>1-3</w:t>
+              <w:t>1</w:t>
             </w:r>
           </w:p>
           <w:p>
@@ -1256,7 +1256,7 @@
                 <w:b/>
                 <w:sz w:val="16"/>
               </w:rPr>
-              <w:t>1-3</w:t>
+              <w:t>1</w:t>
             </w:r>
           </w:p>
           <w:p>
@@ -1279,7 +1279,7 @@
                 <w:b/>
                 <w:sz w:val="16"/>
               </w:rPr>
-              <w:t>1-3</w:t>
+              <w:t>1</w:t>
             </w:r>
           </w:p>
           <w:p>
@@ -1304,7 +1304,7 @@
                 <w:b/>
                 <w:sz w:val="16"/>
               </w:rPr>
-              <w:t>1-3</w:t>
+              <w:t>2</w:t>
             </w:r>
           </w:p>
           <w:p>
@@ -1327,7 +1327,7 @@
                 <w:b/>
                 <w:sz w:val="16"/>
               </w:rPr>
-              <w:t>1-3</w:t>
+              <w:t>2</w:t>
             </w:r>
           </w:p>
           <w:p>
@@ -1350,7 +1350,7 @@
                 <w:b/>
                 <w:sz w:val="16"/>
               </w:rPr>
-              <w:t>1-3</w:t>
+              <w:t>2</w:t>
             </w:r>
           </w:p>
           <w:p>
@@ -1375,7 +1375,7 @@
                 <w:b/>
                 <w:sz w:val="16"/>
               </w:rPr>
-              <w:t>1-3</w:t>
+              <w:t>2</w:t>
             </w:r>
           </w:p>
           <w:p>
@@ -1398,7 +1398,7 @@
                 <w:b/>
                 <w:sz w:val="16"/>
               </w:rPr>
-              <w:t>1-3</w:t>
+              <w:t>2</w:t>
             </w:r>
           </w:p>
           <w:p>
@@ -1421,7 +1421,7 @@
                 <w:b/>
                 <w:sz w:val="16"/>
               </w:rPr>
-              <w:t>1-3</w:t>
+              <w:t>2</w:t>
             </w:r>
           </w:p>
           <w:p>
@@ -1446,7 +1446,7 @@
                 <w:b/>
                 <w:sz w:val="16"/>
               </w:rPr>
-              <w:t>1-3</w:t>
+              <w:t>3</w:t>
             </w:r>
           </w:p>
           <w:p>
@@ -1469,7 +1469,7 @@
                 <w:b/>
                 <w:sz w:val="16"/>
               </w:rPr>
-              <w:t>1-3</w:t>
+              <w:t>3</w:t>
             </w:r>
           </w:p>
           <w:p>
@@ -1492,7 +1492,7 @@
                 <w:b/>
                 <w:sz w:val="16"/>
               </w:rPr>
-              <w:t>1-3</w:t>
+              <w:t>3</w:t>
             </w:r>
           </w:p>
           <w:p>
@@ -2511,7 +2511,7 @@
                 <w:b/>
                 <w:sz w:val="16"/>
               </w:rPr>
-              <w:t>1-6</w:t>
+              <w:t>1</w:t>
             </w:r>
           </w:p>
           <w:p>
@@ -2542,7 +2542,7 @@
                 <w:b/>
                 <w:sz w:val="16"/>
               </w:rPr>
-              <w:t>1-6</w:t>
+              <w:t>1</w:t>
             </w:r>
           </w:p>
           <w:p>
@@ -2565,7 +2565,7 @@
                 <w:b/>
                 <w:sz w:val="16"/>
               </w:rPr>
-              <w:t>1-6</w:t>
+              <w:t>1</w:t>
             </w:r>
           </w:p>
           <w:p>
@@ -2590,7 +2590,7 @@
                 <w:b/>
                 <w:sz w:val="16"/>
               </w:rPr>
-              <w:t>1-6</w:t>
+              <w:t>2-6</w:t>
             </w:r>
           </w:p>
           <w:p>
@@ -2613,7 +2613,7 @@
                 <w:b/>
                 <w:sz w:val="16"/>
               </w:rPr>
-              <w:t>1-6</w:t>
+              <w:t>2-6</w:t>
             </w:r>
           </w:p>
           <w:p>
@@ -2636,7 +2636,7 @@
                 <w:b/>
                 <w:sz w:val="16"/>
               </w:rPr>
-              <w:t>1-6</w:t>
+              <w:t>2-6</w:t>
             </w:r>
           </w:p>
           <w:p>
@@ -3363,7 +3363,7 @@
                 <w:b/>
                 <w:sz w:val="16"/>
               </w:rPr>
-              <w:t>1-7</w:t>
+              <w:t>1</w:t>
             </w:r>
           </w:p>
           <w:p>
@@ -3394,7 +3394,7 @@
                 <w:b/>
                 <w:sz w:val="16"/>
               </w:rPr>
-              <w:t>1-7</w:t>
+              <w:t>1</w:t>
             </w:r>
           </w:p>
           <w:p>
@@ -3417,7 +3417,7 @@
                 <w:b/>
                 <w:sz w:val="16"/>
               </w:rPr>
-              <w:t>1-7</w:t>
+              <w:t>1</w:t>
             </w:r>
           </w:p>
           <w:p>
@@ -3442,7 +3442,7 @@
                 <w:b/>
                 <w:sz w:val="16"/>
               </w:rPr>
-              <w:t>1-7</w:t>
+              <w:t>2-7</w:t>
             </w:r>
           </w:p>
           <w:p>
@@ -3465,7 +3465,7 @@
                 <w:b/>
                 <w:sz w:val="16"/>
               </w:rPr>
-              <w:t>1-7</w:t>
+              <w:t>2-7</w:t>
             </w:r>
           </w:p>
           <w:p>
@@ -3488,7 +3488,7 @@
                 <w:b/>
                 <w:sz w:val="16"/>
               </w:rPr>
-              <w:t>1-7</w:t>
+              <w:t>2-7</w:t>
             </w:r>
           </w:p>
           <w:p>
@@ -4014,7 +4014,7 @@
                 <w:b/>
                 <w:sz w:val="16"/>
               </w:rPr>
-              <w:t>11-15</w:t>
+              <w:t>11-16</w:t>
             </w:r>
           </w:p>
           <w:p>
@@ -4037,7 +4037,7 @@
                 <w:b/>
                 <w:sz w:val="16"/>
               </w:rPr>
-              <w:t>11-15</w:t>
+              <w:t>11-16</w:t>
             </w:r>
           </w:p>
           <w:p>
@@ -4060,7 +4060,7 @@
                 <w:b/>
                 <w:sz w:val="16"/>
               </w:rPr>
-              <w:t>11-15</w:t>
+              <w:t>11-16</w:t>
             </w:r>
           </w:p>
           <w:p>
@@ -4085,22 +4085,7 @@
                 <w:b/>
                 <w:sz w:val="16"/>
               </w:rPr>
-              <w:t>16-21</w:t>
-            </w:r>
-          </w:p>
-          <w:p>
-            <w:r>
-              <w:rPr>
-                <w:sz w:val="18"/>
-              </w:rPr>
-              <w:t>“And so I’m not keeping one bit of this quiet,       I’m laying it all out on the table;       my complaining to high heaven is bitter, but honest.  Are you going to put a muzzle on me,       the way you quiet the sea and still the storm?  If I say, ‘I’m going to bed, then I’ll feel better.       A little nap will lift my spirits,’  You come and so scare me with nightmares       and frighten me with ghosts  That I’d rather strangle in the sheets       than face this kind of life any longer.  I hate this life! Who needs any more of this?       Let me alone! There’s nothing to my life—it’s nothing           but smoke.</w:t>
-            </w:r>
-          </w:p>
-          <w:p>
-            <w:r>
-              <w:rPr>
-                <w:sz w:val="18"/>
-              </w:rPr>
+              <w:t>17-21</w:t>
             </w:r>
           </w:p>
           <w:p>
@@ -4123,7 +4108,7 @@
                 <w:b/>
                 <w:sz w:val="16"/>
               </w:rPr>
-              <w:t>16-21</w:t>
+              <w:t>17-21</w:t>
             </w:r>
           </w:p>
           <w:p>
@@ -4146,7 +4131,7 @@
                 <w:b/>
                 <w:sz w:val="16"/>
               </w:rPr>
-              <w:t>16-21</w:t>
+              <w:t>17-21</w:t>
             </w:r>
           </w:p>
           <w:p>
@@ -4317,53 +4302,30 @@
                 <w:b/>
                 <w:sz w:val="16"/>
               </w:rPr>
-              <w:t>2-8</w:t>
-            </w:r>
-          </w:p>
-          <w:p>
-            <w:r>
-              <w:rPr>
-                <w:sz w:val="18"/>
-              </w:rPr>
-              <w:t>Bildad from Shuhah was next to speak:</w:t>
-            </w:r>
-          </w:p>
-          <w:p>
-            <w:r>
-              <w:rPr>
-                <w:sz w:val="18"/>
-              </w:rPr>
-              <w:t>“How can you keep on talking like this?       You’re talking nonsense, and noisy nonsense at that.  Does God mess up?       Does God Almighty ever get things backward?  It’s plain that your children sinned against him—       otherwise, why would God have punished them?  Here’s what you must do—and don’t put it off any longer:       Get down on your knees before God Almighty.  If you’re as innocent and upright as you say,       it’s not too late—he’ll come running; he’ll set everything right again, reestablish your fortunes.  Even though you’re not much right now,       you’ll end up better than ever.</w:t>
-            </w:r>
-          </w:p>
-          <w:p>
-            <w:r>
-              <w:rPr>
-                <w:sz w:val="18"/>
-              </w:rPr>
-            </w:r>
-          </w:p>
-          <w:p>
-            <w:r>
-              <w:rPr>
-                <w:sz w:val="18"/>
-              </w:rPr>
-              <w:t>“Put the question to our ancestors,       study what they learned from their ancestors.  For we’re newcomers at this, with a lot to learn,       and not too long to learn it.  So why not let the ancients teach you, tell you what’s what,       instruct you in what they knew from experience?  Can mighty pine trees grow tall without soil?       Can luscious tomatoes flourish without water?  Blossoming flowers look beautiful before they’re cut or picked,       but without soil or water they wither more quickly than grass.  That’s what happens to all who forget God—       all their hopes come to nothing.  They hang their life from one thin thread,       they hitch their fate to a spider web.  One jiggle and the thread breaks,       one jab and the web collapses.  Or they’re like weeds springing up in the sunshine,       invading the garden,  Spreading everywhere, overtaking the flowers,       getting a foothold even in the rocks.  But when the gardener rips them out by the roots,       the garden doesn’t miss them one bit.  The sooner the godless are gone, the better;       then good plants can grow in their place.</w:t>
-            </w:r>
-          </w:p>
-        </w:tc>
-        <w:tc>
-          <w:tcPr>
-            <w:tcW w:type="dxa" w:w="2880"/>
-          </w:tcPr>
-          <w:p>
-            <w:r/>
-            <w:r>
-              <w:rPr>
-                <w:b/>
-                <w:sz w:val="16"/>
-              </w:rPr>
-              <w:t>2-8</w:t>
+              <w:t>2-7</w:t>
+            </w:r>
+          </w:p>
+          <w:p>
+            <w:r>
+              <w:rPr>
+                <w:sz w:val="18"/>
+              </w:rPr>
+              <w:t>↑ 위 MSG(1-7) 계속</w:t>
+            </w:r>
+          </w:p>
+        </w:tc>
+        <w:tc>
+          <w:tcPr>
+            <w:tcW w:type="dxa" w:w="2880"/>
+          </w:tcPr>
+          <w:p>
+            <w:r/>
+            <w:r>
+              <w:rPr>
+                <w:b/>
+                <w:sz w:val="16"/>
+              </w:rPr>
+              <w:t>2-7</w:t>
             </w:r>
           </w:p>
           <w:p>
@@ -4386,7 +4348,7 @@
                 <w:b/>
                 <w:sz w:val="16"/>
               </w:rPr>
-              <w:t>2-8</w:t>
+              <w:t>2-7</w:t>
             </w:r>
           </w:p>
           <w:p>
@@ -4411,7 +4373,7 @@
                 <w:b/>
                 <w:sz w:val="16"/>
               </w:rPr>
-              <w:t>9-20</w:t>
+              <w:t>8-19</w:t>
             </w:r>
           </w:p>
           <w:p>
@@ -4422,34 +4384,19 @@
               <w:t>“Put the question to our ancestors,       study what they learned from their ancestors.  For we’re newcomers at this, with a lot to learn,       and not too long to learn it.  So why not let the ancients teach you, tell you what’s what,       instruct you in what they knew from experience?  Can mighty pine trees grow tall without soil?       Can luscious tomatoes flourish without water?  Blossoming flowers look beautiful before they’re cut or picked,       but without soil or water they wither more quickly than grass.  That’s what happens to all who forget God—       all their hopes come to nothing.  They hang their life from one thin thread,       they hitch their fate to a spider web.  One jiggle and the thread breaks,       one jab and the web collapses.  Or they’re like weeds springing up in the sunshine,       invading the garden,  Spreading everywhere, overtaking the flowers,       getting a foothold even in the rocks.  But when the gardener rips them out by the roots,       the garden doesn’t miss them one bit.  The sooner the godless are gone, the better;       then good plants can grow in their place.</w:t>
             </w:r>
           </w:p>
-          <w:p>
-            <w:r>
-              <w:rPr>
-                <w:sz w:val="18"/>
-              </w:rPr>
-            </w:r>
-          </w:p>
-          <w:p>
-            <w:r>
-              <w:rPr>
-                <w:sz w:val="18"/>
-              </w:rPr>
-              <w:t>“There’s no way that God will reject a good person,       and there is no way he’ll help a bad one.  God will let you laugh again;       you’ll raise the roof with shouts of joy,  With your enemies thoroughly discredited,       their house of cards collapsed.”</w:t>
-            </w:r>
-          </w:p>
-        </w:tc>
-        <w:tc>
-          <w:tcPr>
-            <w:tcW w:type="dxa" w:w="2880"/>
-          </w:tcPr>
-          <w:p>
-            <w:r/>
-            <w:r>
-              <w:rPr>
-                <w:b/>
-                <w:sz w:val="16"/>
-              </w:rPr>
-              <w:t>9-20</w:t>
+        </w:tc>
+        <w:tc>
+          <w:tcPr>
+            <w:tcW w:type="dxa" w:w="2880"/>
+          </w:tcPr>
+          <w:p>
+            <w:r/>
+            <w:r>
+              <w:rPr>
+                <w:b/>
+                <w:sz w:val="16"/>
+              </w:rPr>
+              <w:t>8-19</w:t>
             </w:r>
           </w:p>
           <w:p>
@@ -4472,7 +4419,7 @@
                 <w:b/>
                 <w:sz w:val="16"/>
               </w:rPr>
-              <w:t>9-20</w:t>
+              <w:t>8-19</w:t>
             </w:r>
           </w:p>
           <w:p>
@@ -4497,7 +4444,7 @@
                 <w:b/>
                 <w:sz w:val="16"/>
               </w:rPr>
-              <w:t>21-22</w:t>
+              <w:t>20-22</w:t>
             </w:r>
           </w:p>
           <w:p>
@@ -4520,7 +4467,7 @@
                 <w:b/>
                 <w:sz w:val="16"/>
               </w:rPr>
-              <w:t>21-22</w:t>
+              <w:t>20-22</w:t>
             </w:r>
           </w:p>
           <w:p>
@@ -4543,7 +4490,7 @@
                 <w:b/>
                 <w:sz w:val="16"/>
               </w:rPr>
-              <w:t>21-22</w:t>
+              <w:t>20-22</w:t>
             </w:r>
           </w:p>
           <w:p>
@@ -5716,53 +5663,30 @@
                 <w:b/>
                 <w:sz w:val="16"/>
               </w:rPr>
-              <w:t>2-7</w:t>
-            </w:r>
-          </w:p>
-          <w:p>
-            <w:r>
-              <w:rPr>
-                <w:sz w:val="18"/>
-              </w:rPr>
-              <w:t>Now it was the turn of Zophar from Naamath:</w:t>
-            </w:r>
-          </w:p>
-          <w:p>
-            <w:r>
-              <w:rPr>
-                <w:sz w:val="18"/>
-              </w:rPr>
-              <w:t>“What a flood of words! Shouldn’t we put a stop to it?       Should this kind of loose talk be permitted?  Job, do you think you can carry on like this and we’ll say nothing?       That we’ll let you rail and mock and not step in?  You claim, ‘My doctrine is sound       and my conduct impeccable.’  How I wish God would give you a piece of his mind,       tell you what’s what!  I wish he’d show you how wisdom looks from the inside,       for true wisdom is mostly ‘inside.’  But you can be sure of this,       you haven’t gotten half of what you deserve.</w:t>
-            </w:r>
-          </w:p>
-          <w:p>
-            <w:r>
-              <w:rPr>
-                <w:sz w:val="18"/>
-              </w:rPr>
-            </w:r>
-          </w:p>
-          <w:p>
-            <w:r>
-              <w:rPr>
-                <w:sz w:val="18"/>
-              </w:rPr>
-              <w:t>“Do you think you can explain the mystery of God?       Do you think you can diagram God Almighty?  God is far higher than you can imagine,       far deeper than you can comprehend,  Stretching farther than earth’s horizons,       far wider than the endless ocean.  If he happens along, throws you in jail then hauls you into court, can you do anything about it?  He sees through vain pretensions,       spots evil a long way off—       no one pulls the wool over *his* eyes!  Hollow men, hollow women, will wise up       about the same time mules learn to talk.</w:t>
-            </w:r>
-          </w:p>
-        </w:tc>
-        <w:tc>
-          <w:tcPr>
-            <w:tcW w:type="dxa" w:w="2880"/>
-          </w:tcPr>
-          <w:p>
-            <w:r/>
-            <w:r>
-              <w:rPr>
-                <w:b/>
-                <w:sz w:val="16"/>
-              </w:rPr>
-              <w:t>2-7</w:t>
+              <w:t>2-6</w:t>
+            </w:r>
+          </w:p>
+          <w:p>
+            <w:r>
+              <w:rPr>
+                <w:sz w:val="18"/>
+              </w:rPr>
+              <w:t>↑ 위 MSG(1-6) 계속</w:t>
+            </w:r>
+          </w:p>
+        </w:tc>
+        <w:tc>
+          <w:tcPr>
+            <w:tcW w:type="dxa" w:w="2880"/>
+          </w:tcPr>
+          <w:p>
+            <w:r/>
+            <w:r>
+              <w:rPr>
+                <w:b/>
+                <w:sz w:val="16"/>
+              </w:rPr>
+              <w:t>2-6</w:t>
             </w:r>
           </w:p>
           <w:p>
@@ -5785,7 +5709,7 @@
                 <w:b/>
                 <w:sz w:val="16"/>
               </w:rPr>
-              <w:t>2-7</w:t>
+              <w:t>2-6</w:t>
             </w:r>
           </w:p>
           <w:p>
@@ -5810,7 +5734,7 @@
                 <w:b/>
                 <w:sz w:val="16"/>
               </w:rPr>
-              <w:t>8-12</w:t>
+              <w:t>7-12</w:t>
             </w:r>
           </w:p>
           <w:p>
@@ -5833,7 +5757,7 @@
                 <w:b/>
                 <w:sz w:val="16"/>
               </w:rPr>
-              <w:t>8-12</w:t>
+              <w:t>7-12</w:t>
             </w:r>
           </w:p>
           <w:p>
@@ -5856,7 +5780,7 @@
                 <w:b/>
                 <w:sz w:val="16"/>
               </w:rPr>
-              <w:t>8-12</w:t>
+              <w:t>7-12</w:t>
             </w:r>
           </w:p>
           <w:p>
@@ -7167,53 +7091,30 @@
                 <w:b/>
                 <w:sz w:val="16"/>
               </w:rPr>
-              <w:t>2-17</w:t>
-            </w:r>
-          </w:p>
-          <w:p>
-            <w:r>
-              <w:rPr>
-                <w:sz w:val="18"/>
-              </w:rPr>
-              <w:t>Eliphaz of Teman spoke a second time:</w:t>
-            </w:r>
-          </w:p>
-          <w:p>
-            <w:r>
-              <w:rPr>
-                <w:sz w:val="18"/>
-              </w:rPr>
-              <w:t>“If you were truly wise, would you sound so much like a       windbag, belching hot air?  Would you talk nonsense in the middle of a serious argument, babbling baloney?  Look at you! You trivialize religion,       turn spiritual conversation into empty gossip.  It’s your sin that taught you to talk this way. You chose an education in fraud.  Your own words have exposed your guilt.       It’s nothing I’ve said—you’ve incriminated yourself!  Do you think you’re the first person to have to deal with these things?       Have you been around as long as the hills?  Were you listening in when God planned all this?       Do you think you’re the only one who knows anything?  What do you know that we don’t know?       What insights do you have that we’ve missed?  Gray beards and white hair back us up—       old folks who’ve been around a lot longer than you.  Are God’s promises not enough for you,       spoken so gently and tenderly? Why do you let your emotions take over,       lashing out and spitting fire,  Pitting your whole being against God       by letting words like this come out of your mouth?  Do you think it’s possible for any mere mortal to be sinless in God’s sight,       for anyone born of a human mother to get it all together?  Why, God can’t even trust his holy angels.       He sees the flaws in the very heavens themselves,  So how much less we humans, smelly and foul,       who lap up evil like water?</w:t>
-            </w:r>
-          </w:p>
-          <w:p>
-            <w:r>
-              <w:rPr>
-                <w:sz w:val="18"/>
-              </w:rPr>
-            </w:r>
-          </w:p>
-          <w:p>
-            <w:r>
-              <w:rPr>
-                <w:sz w:val="18"/>
-              </w:rPr>
-              <w:t>“I’ve a thing or two to tell you, so listen up!       I’m letting you in on my views;  It’s what wise men and women have always taught,       holding nothing back from what *they* were taught  By their parents, back in the days       when they had this land all to themselves:  Those who live by their own rules, not God’s, can expect nothing but trouble,       and the longer they live, the worse it gets.  Every little sound terrifies them.       Just when they think they have it made, disaster strikes.  They despair of things ever getting better—       they’re on the list of people for whom things always turn out for the worst.  They wander here and there,       never knowing where the next meal is coming from—       every day is doomsday!  They live in constant terror, always with their backs up against the wall  Because they insist on shaking their fists at God,       defying God Almighty to his face,  Always and ever at odds with God,       always on the defensive.</w:t>
-            </w:r>
-          </w:p>
-        </w:tc>
-        <w:tc>
-          <w:tcPr>
-            <w:tcW w:type="dxa" w:w="2880"/>
-          </w:tcPr>
-          <w:p>
-            <w:r/>
-            <w:r>
-              <w:rPr>
-                <w:b/>
-                <w:sz w:val="16"/>
-              </w:rPr>
-              <w:t>2-17</w:t>
+              <w:t>2-16</w:t>
+            </w:r>
+          </w:p>
+          <w:p>
+            <w:r>
+              <w:rPr>
+                <w:sz w:val="18"/>
+              </w:rPr>
+              <w:t>↑ 위 MSG(1-16) 계속</w:t>
+            </w:r>
+          </w:p>
+        </w:tc>
+        <w:tc>
+          <w:tcPr>
+            <w:tcW w:type="dxa" w:w="2880"/>
+          </w:tcPr>
+          <w:p>
+            <w:r/>
+            <w:r>
+              <w:rPr>
+                <w:b/>
+                <w:sz w:val="16"/>
+              </w:rPr>
+              <w:t>2-16</w:t>
             </w:r>
           </w:p>
           <w:p>
@@ -7236,7 +7137,7 @@
                 <w:b/>
                 <w:sz w:val="16"/>
               </w:rPr>
-              <w:t>2-17</w:t>
+              <w:t>2-16</w:t>
             </w:r>
           </w:p>
           <w:p>
@@ -7261,7 +7162,7 @@
                 <w:b/>
                 <w:sz w:val="16"/>
               </w:rPr>
-              <w:t>18-27</w:t>
+              <w:t>17-26</w:t>
             </w:r>
           </w:p>
           <w:p>
@@ -7272,34 +7173,19 @@
               <w:t>“I’ve a thing or two to tell you, so listen up!       I’m letting you in on my views;  It’s what wise men and women have always taught,       holding nothing back from what *they* were taught  By their parents, back in the days       when they had this land all to themselves:  Those who live by their own rules, not God’s, can expect nothing but trouble,       and the longer they live, the worse it gets.  Every little sound terrifies them.       Just when they think they have it made, disaster strikes.  They despair of things ever getting better—       they’re on the list of people for whom things always turn out for the worst.  They wander here and there,       never knowing where the next meal is coming from—       every day is doomsday!  They live in constant terror, always with their backs up against the wall  Because they insist on shaking their fists at God,       defying God Almighty to his face,  Always and ever at odds with God,       always on the defensive.</w:t>
             </w:r>
           </w:p>
-          <w:p>
-            <w:r>
-              <w:rPr>
-                <w:sz w:val="18"/>
-              </w:rPr>
-            </w:r>
-          </w:p>
-          <w:p>
-            <w:r>
-              <w:rPr>
-                <w:sz w:val="18"/>
-              </w:rPr>
-              <w:t>“Even if they’re the picture of health,       trim and fit and youthful,  They’ll end up living in a ghost town       sleeping in a hovel not fit for a dog,       a ramshackle shack.  They’ll never get ahead,       never amount to much of anything.  And then death—don’t think they’ll escape that!       They’ll end up shriveled weeds,       brought down by a puff of God’s breath.  There’s a lesson here: Whoever invests in lies,       gets lies for interest,  Paid in full before the due date.       Some investment!  They’ll be like fruit frost-killed before it ripens,       like buds sheared off before they bloom.  The godless are fruitless—a barren crew;       a life built on bribes goes up in smoke.  They have sex with sin and give birth to evil.       Their lives are wombs for breeding deceit.”</w:t>
-            </w:r>
-          </w:p>
-        </w:tc>
-        <w:tc>
-          <w:tcPr>
-            <w:tcW w:type="dxa" w:w="2880"/>
-          </w:tcPr>
-          <w:p>
-            <w:r/>
-            <w:r>
-              <w:rPr>
-                <w:b/>
-                <w:sz w:val="16"/>
-              </w:rPr>
-              <w:t>18-27</w:t>
+        </w:tc>
+        <w:tc>
+          <w:tcPr>
+            <w:tcW w:type="dxa" w:w="2880"/>
+          </w:tcPr>
+          <w:p>
+            <w:r/>
+            <w:r>
+              <w:rPr>
+                <w:b/>
+                <w:sz w:val="16"/>
+              </w:rPr>
+              <w:t>17-26</w:t>
             </w:r>
           </w:p>
           <w:p>
@@ -7322,7 +7208,7 @@
                 <w:b/>
                 <w:sz w:val="16"/>
               </w:rPr>
-              <w:t>18-27</w:t>
+              <w:t>17-26</w:t>
             </w:r>
           </w:p>
           <w:p>
@@ -7347,7 +7233,7 @@
                 <w:b/>
                 <w:sz w:val="16"/>
               </w:rPr>
-              <w:t>28-35</w:t>
+              <w:t>27-35</w:t>
             </w:r>
           </w:p>
           <w:p>
@@ -7370,7 +7256,7 @@
                 <w:b/>
                 <w:sz w:val="16"/>
               </w:rPr>
-              <w:t>28-35</w:t>
+              <w:t>27-35</w:t>
             </w:r>
           </w:p>
           <w:p>
@@ -7393,7 +7279,7 @@
                 <w:b/>
                 <w:sz w:val="16"/>
               </w:rPr>
-              <w:t>28-35</w:t>
+              <w:t>27-35</w:t>
             </w:r>
           </w:p>
           <w:p>
@@ -8424,53 +8310,30 @@
                 <w:b/>
                 <w:sz w:val="16"/>
               </w:rPr>
-              <w:t>2-5</w:t>
-            </w:r>
-          </w:p>
-          <w:p>
-            <w:r>
-              <w:rPr>
-                <w:sz w:val="18"/>
-              </w:rPr>
-              <w:t>Bildad from Shuhah chimed in:</w:t>
-            </w:r>
-          </w:p>
-          <w:p>
-            <w:r>
-              <w:rPr>
-                <w:sz w:val="18"/>
-              </w:rPr>
-              <w:t>“How monotonous these word games are getting!       Get serious! We need to get down to business.  Why do you treat your friends like slow-witted animals? You look down on us as if we don’t know anything.  Why are you working yourself up like this?       Do you want the world redesigned to suit you?       Should reality be suspended to accommodate you?</w:t>
-            </w:r>
-          </w:p>
-          <w:p>
-            <w:r>
-              <w:rPr>
-                <w:sz w:val="18"/>
-              </w:rPr>
-            </w:r>
-          </w:p>
-          <w:p>
-            <w:r>
-              <w:rPr>
-                <w:sz w:val="18"/>
-              </w:rPr>
-              <w:t>“Here’s the rule: The light of the wicked is put out.       Their flame dies down and is extinguished.  Their house goes dark—       every lamp in the place goes out.  Their strong strides weaken, falter;       they stumble into their own traps.  They get all tangled up       in their own red tape,  Their feet are grabbed and caught,       their necks in a noose.  They trip on ropes they’ve hidden,       and fall into pits they’ve dug themselves.  Terrors come at them from all sides.       They run dazed and confused.  The hungry grave is ready       to gobble them up for supper,  To lay them out for a gourmet meal, a treat for ravenous Death.  They are snatched from their home sweet home       and marched straight to the death house.  Their lives go up in smoke; acid rain soaks their ruins.  Their roots rot       and their branches wither.  They’ll never again be remembered—       nameless in unmarked graves.  They are plunged from light into darkness,       banished from the world.  And they leave empty-handed—not one single child—       nothing to show for their life on this earth.  Westerners are aghast at their fate,       easterners are horrified:  ‘Oh no! So this is what happens to perverse people.       This is how the God-ignorant end up!’”</w:t>
-            </w:r>
-          </w:p>
-        </w:tc>
-        <w:tc>
-          <w:tcPr>
-            <w:tcW w:type="dxa" w:w="2880"/>
-          </w:tcPr>
-          <w:p>
-            <w:r/>
-            <w:r>
-              <w:rPr>
-                <w:b/>
-                <w:sz w:val="16"/>
-              </w:rPr>
-              <w:t>2-5</w:t>
+              <w:t>2-4</w:t>
+            </w:r>
+          </w:p>
+          <w:p>
+            <w:r>
+              <w:rPr>
+                <w:sz w:val="18"/>
+              </w:rPr>
+              <w:t>↑ 위 MSG(1-4) 계속</w:t>
+            </w:r>
+          </w:p>
+        </w:tc>
+        <w:tc>
+          <w:tcPr>
+            <w:tcW w:type="dxa" w:w="2880"/>
+          </w:tcPr>
+          <w:p>
+            <w:r/>
+            <w:r>
+              <w:rPr>
+                <w:b/>
+                <w:sz w:val="16"/>
+              </w:rPr>
+              <w:t>2-4</w:t>
             </w:r>
           </w:p>
           <w:p>
@@ -8493,7 +8356,7 @@
                 <w:b/>
                 <w:sz w:val="16"/>
               </w:rPr>
-              <w:t>2-5</w:t>
+              <w:t>2-4</w:t>
             </w:r>
           </w:p>
           <w:p>
@@ -8518,7 +8381,7 @@
                 <w:b/>
                 <w:sz w:val="16"/>
               </w:rPr>
-              <w:t>6-21</w:t>
+              <w:t>5-21</w:t>
             </w:r>
           </w:p>
           <w:p>
@@ -8541,7 +8404,7 @@
                 <w:b/>
                 <w:sz w:val="16"/>
               </w:rPr>
-              <w:t>6-21</w:t>
+              <w:t>5-21</w:t>
             </w:r>
           </w:p>
           <w:p>
@@ -8564,7 +8427,7 @@
                 <w:b/>
                 <w:sz w:val="16"/>
               </w:rPr>
-              <w:t>6-21</w:t>
+              <w:t>5-21</w:t>
             </w:r>
           </w:p>
           <w:p>
@@ -8814,7 +8677,7 @@
                 <w:b/>
                 <w:sz w:val="16"/>
               </w:rPr>
-              <w:t>7-13</w:t>
+              <w:t>7-12</w:t>
             </w:r>
           </w:p>
           <w:p>
@@ -8825,34 +8688,19 @@
               <w:t>“Look at me—I shout ‘Murder!’ and I’m ignored;       I call for help and no one bothers to stop.  God threw a barricade across my path—I’m stymied; he turned out all the lights—I’m stuck in the dark.  He destroyed my reputation,       robbed me of all self-respect.  He tore me apart piece by piece—I’m ruined!       Then he yanked out hope by the roots.  He’s angry with me—oh, how he’s angry!       He treats me like his worst enemy.  He has launched a major campaign against me,       using every weapon he can think of,       coming at me from all sides at once.</w:t>
             </w:r>
           </w:p>
-          <w:p>
-            <w:r>
-              <w:rPr>
-                <w:sz w:val="18"/>
-              </w:rPr>
-            </w:r>
-          </w:p>
-          <w:p>
-            <w:r>
-              <w:rPr>
-                <w:sz w:val="18"/>
-              </w:rPr>
-              <w:t>“God alienated my family from me;       everyone who knows me avoids me.  My relatives and friends have all left;       houseguests forget I ever existed. The servant girls treat me like a deadbeat off the street,       look at me like they’ve never seen me before.  I call my attendant and he ignores me, ignores me even though I plead with him.  My wife can’t stand to be around me anymore.       I’m repulsive to my family.  Even street urchins despise me; when I come out, they taunt and jeer.  Everyone I’ve ever been close to abhors me;       my dearest loved ones reject me.  I’m nothing but a bag of bones; my life hangs by a thread.</w:t>
-            </w:r>
-          </w:p>
-        </w:tc>
-        <w:tc>
-          <w:tcPr>
-            <w:tcW w:type="dxa" w:w="2880"/>
-          </w:tcPr>
-          <w:p>
-            <w:r/>
-            <w:r>
-              <w:rPr>
-                <w:b/>
-                <w:sz w:val="16"/>
-              </w:rPr>
-              <w:t>7-13</w:t>
+        </w:tc>
+        <w:tc>
+          <w:tcPr>
+            <w:tcW w:type="dxa" w:w="2880"/>
+          </w:tcPr>
+          <w:p>
+            <w:r/>
+            <w:r>
+              <w:rPr>
+                <w:b/>
+                <w:sz w:val="16"/>
+              </w:rPr>
+              <w:t>7-12</w:t>
             </w:r>
           </w:p>
           <w:p>
@@ -8875,7 +8723,7 @@
                 <w:b/>
                 <w:sz w:val="16"/>
               </w:rPr>
-              <w:t>7-13</w:t>
+              <w:t>7-12</w:t>
             </w:r>
           </w:p>
           <w:p>
@@ -8900,7 +8748,7 @@
                 <w:b/>
                 <w:sz w:val="16"/>
               </w:rPr>
-              <w:t>14-21</w:t>
+              <w:t>13-20</w:t>
             </w:r>
           </w:p>
           <w:p>
@@ -8911,34 +8759,19 @@
               <w:t>“God alienated my family from me;       everyone who knows me avoids me.  My relatives and friends have all left;       houseguests forget I ever existed. The servant girls treat me like a deadbeat off the street,       look at me like they’ve never seen me before.  I call my attendant and he ignores me, ignores me even though I plead with him.  My wife can’t stand to be around me anymore.       I’m repulsive to my family.  Even street urchins despise me; when I come out, they taunt and jeer.  Everyone I’ve ever been close to abhors me;       my dearest loved ones reject me.  I’m nothing but a bag of bones; my life hangs by a thread.</w:t>
             </w:r>
           </w:p>
-          <w:p>
-            <w:r>
-              <w:rPr>
-                <w:sz w:val="18"/>
-              </w:rPr>
-            </w:r>
-          </w:p>
-          <w:p>
-            <w:r>
-              <w:rPr>
-                <w:sz w:val="18"/>
-              </w:rPr>
-              <w:t>“Oh, friends, dear friends, take pity on me.       God has come down hard on me!  Do you have to be hard on me, too?       Don’t you ever tire of abusing me?</w:t>
-            </w:r>
-          </w:p>
-        </w:tc>
-        <w:tc>
-          <w:tcPr>
-            <w:tcW w:type="dxa" w:w="2880"/>
-          </w:tcPr>
-          <w:p>
-            <w:r/>
-            <w:r>
-              <w:rPr>
-                <w:b/>
-                <w:sz w:val="16"/>
-              </w:rPr>
-              <w:t>14-21</w:t>
+        </w:tc>
+        <w:tc>
+          <w:tcPr>
+            <w:tcW w:type="dxa" w:w="2880"/>
+          </w:tcPr>
+          <w:p>
+            <w:r/>
+            <w:r>
+              <w:rPr>
+                <w:b/>
+                <w:sz w:val="16"/>
+              </w:rPr>
+              <w:t>13-20</w:t>
             </w:r>
           </w:p>
           <w:p>
@@ -8961,7 +8794,7 @@
                 <w:b/>
                 <w:sz w:val="16"/>
               </w:rPr>
-              <w:t>14-21</w:t>
+              <w:t>13-20</w:t>
             </w:r>
           </w:p>
           <w:p>
@@ -8986,7 +8819,7 @@
                 <w:b/>
                 <w:sz w:val="16"/>
               </w:rPr>
-              <w:t>22-23</w:t>
+              <w:t>21-22</w:t>
             </w:r>
           </w:p>
           <w:p>
@@ -8997,34 +8830,19 @@
               <w:t>“Oh, friends, dear friends, take pity on me.       God has come down hard on me!  Do you have to be hard on me, too?       Don’t you ever tire of abusing me?</w:t>
             </w:r>
           </w:p>
-          <w:p>
-            <w:r>
-              <w:rPr>
-                <w:sz w:val="18"/>
-              </w:rPr>
-            </w:r>
-          </w:p>
-          <w:p>
-            <w:r>
-              <w:rPr>
-                <w:sz w:val="18"/>
-              </w:rPr>
-              <w:t>“If only my words were written in a book—       better yet, chiseled in stone!  Still, I know that God lives—the One who gives me back my life—       and eventually he’ll take his stand on earth.  And I’ll see him—even though I get skinned alive!—       see God myself, with my very own eyes.       Oh, how I long for that day!</w:t>
-            </w:r>
-          </w:p>
-        </w:tc>
-        <w:tc>
-          <w:tcPr>
-            <w:tcW w:type="dxa" w:w="2880"/>
-          </w:tcPr>
-          <w:p>
-            <w:r/>
-            <w:r>
-              <w:rPr>
-                <w:b/>
-                <w:sz w:val="16"/>
-              </w:rPr>
-              <w:t>22-23</w:t>
+        </w:tc>
+        <w:tc>
+          <w:tcPr>
+            <w:tcW w:type="dxa" w:w="2880"/>
+          </w:tcPr>
+          <w:p>
+            <w:r/>
+            <w:r>
+              <w:rPr>
+                <w:b/>
+                <w:sz w:val="16"/>
+              </w:rPr>
+              <w:t>21-22</w:t>
             </w:r>
           </w:p>
           <w:p>
@@ -9047,7 +8865,7 @@
                 <w:b/>
                 <w:sz w:val="16"/>
               </w:rPr>
-              <w:t>22-23</w:t>
+              <w:t>21-22</w:t>
             </w:r>
           </w:p>
           <w:p>
@@ -9072,7 +8890,7 @@
                 <w:b/>
                 <w:sz w:val="16"/>
               </w:rPr>
-              <w:t>24-27</w:t>
+              <w:t>23-27</w:t>
             </w:r>
           </w:p>
           <w:p>
@@ -9095,7 +8913,7 @@
                 <w:b/>
                 <w:sz w:val="16"/>
               </w:rPr>
-              <w:t>24-27</w:t>
+              <w:t>23-27</w:t>
             </w:r>
           </w:p>
           <w:p>
@@ -9118,7 +8936,7 @@
                 <w:b/>
                 <w:sz w:val="16"/>
               </w:rPr>
-              <w:t>24-27</w:t>
+              <w:t>23-27</w:t>
             </w:r>
           </w:p>
           <w:p>
@@ -9861,7 +9679,7 @@
                 <w:b/>
                 <w:sz w:val="16"/>
               </w:rPr>
-              <w:t>4-15</w:t>
+              <w:t>4-16</w:t>
             </w:r>
           </w:p>
           <w:p>
@@ -9884,7 +9702,7 @@
                 <w:b/>
                 <w:sz w:val="16"/>
               </w:rPr>
-              <w:t>4-15</w:t>
+              <w:t>4-16</w:t>
             </w:r>
           </w:p>
           <w:p>
@@ -9907,7 +9725,7 @@
                 <w:b/>
                 <w:sz w:val="16"/>
               </w:rPr>
-              <w:t>4-15</w:t>
+              <w:t>4-16</w:t>
             </w:r>
           </w:p>
           <w:p>
@@ -9932,22 +9750,7 @@
                 <w:b/>
                 <w:sz w:val="16"/>
               </w:rPr>
-              <w:t>16-21</w:t>
-            </w:r>
-          </w:p>
-          <w:p>
-            <w:r>
-              <w:rPr>
-                <w:sz w:val="18"/>
-              </w:rPr>
-              <w:t>“It’s not *you* I’m complaining to—it’s *God.*       Is it any wonder I’m getting fed up with his silence?  Take a good look at me. Aren’t you appalled by what’s happened?       No! Don’t say anything. I can do without your comments.  When I look back, I go into shock,       my body is racked with spasms.  Why do the wicked have it so good,       live to a ripe old age and get rich?  They get to see their children succeed,       get to watch and enjoy their grandchildren.  Their homes are peaceful and free from fear;       they never experience God’s disciplining rod.  Their bulls breed with great vigor       and their cows calve without fail.  They send their children out to play       and watch them frolic like spring lambs.  They make music with fiddles and flutes, have good times singing and dancing.  They have a long life on easy street,       and die painlessly in their sleep.  They say to God, ‘Get lost! We’ve no interest in you or your ways.  Why should we have dealings with God Almighty?       What’s there in it for us?’  But they’re wrong, dead wrong—they’re not gods.       It’s beyond me how they can carry on like this!</w:t>
-            </w:r>
-          </w:p>
-          <w:p>
-            <w:r>
-              <w:rPr>
-                <w:sz w:val="18"/>
-              </w:rPr>
+              <w:t>17-21</w:t>
             </w:r>
           </w:p>
           <w:p>
@@ -9970,7 +9773,7 @@
                 <w:b/>
                 <w:sz w:val="16"/>
               </w:rPr>
-              <w:t>16-21</w:t>
+              <w:t>17-21</w:t>
             </w:r>
           </w:p>
           <w:p>
@@ -9993,7 +9796,7 @@
                 <w:b/>
                 <w:sz w:val="16"/>
               </w:rPr>
-              <w:t>16-21</w:t>
+              <w:t>17-21</w:t>
             </w:r>
           </w:p>
           <w:p>
@@ -10018,7 +9821,7 @@
                 <w:b/>
                 <w:sz w:val="16"/>
               </w:rPr>
-              <w:t>22-25</w:t>
+              <w:t>22-26</w:t>
             </w:r>
           </w:p>
           <w:p>
@@ -10041,7 +9844,7 @@
                 <w:b/>
                 <w:sz w:val="16"/>
               </w:rPr>
-              <w:t>22-25</w:t>
+              <w:t>22-26</w:t>
             </w:r>
           </w:p>
           <w:p>
@@ -10064,7 +9867,7 @@
                 <w:b/>
                 <w:sz w:val="16"/>
               </w:rPr>
-              <w:t>22-25</w:t>
+              <w:t>22-26</w:t>
             </w:r>
           </w:p>
           <w:p>
@@ -10089,22 +9892,7 @@
                 <w:b/>
                 <w:sz w:val="16"/>
               </w:rPr>
-              <w:t>26-33</w:t>
-            </w:r>
-          </w:p>
-          <w:p>
-            <w:r>
-              <w:rPr>
-                <w:sz w:val="18"/>
-              </w:rPr>
-              <w:t>“But who are we to tell God how to run his affairs?       He’s dealing with matters that are way over our heads.  Some people die in the prime of life, with everything going for them—       fat and sassy.  Others die bitter and bereft,       never getting a taste of happiness.  They’re laid out side by side in the cemetery,       where the worms can’t tell one from the other.</w:t>
-            </w:r>
-          </w:p>
-          <w:p>
-            <w:r>
-              <w:rPr>
-                <w:sz w:val="18"/>
-              </w:rPr>
+              <w:t>27-33</w:t>
             </w:r>
           </w:p>
           <w:p>
@@ -10127,7 +9915,7 @@
                 <w:b/>
                 <w:sz w:val="16"/>
               </w:rPr>
-              <w:t>26-33</w:t>
+              <w:t>27-33</w:t>
             </w:r>
           </w:p>
           <w:p>
@@ -10150,7 +9938,7 @@
                 <w:b/>
                 <w:sz w:val="16"/>
               </w:rPr>
-              <w:t>26-33</w:t>
+              <w:t>27-33</w:t>
             </w:r>
           </w:p>
           <w:p>
@@ -13039,7 +12827,7 @@
                 <w:b/>
                 <w:sz w:val="16"/>
               </w:rPr>
-              <w:t>1-6</w:t>
+              <w:t>1</w:t>
             </w:r>
           </w:p>
           <w:p>
@@ -13070,7 +12858,7 @@
                 <w:b/>
                 <w:sz w:val="16"/>
               </w:rPr>
-              <w:t>1-6</w:t>
+              <w:t>1</w:t>
             </w:r>
           </w:p>
           <w:p>
@@ -13093,7 +12881,7 @@
                 <w:b/>
                 <w:sz w:val="16"/>
               </w:rPr>
-              <w:t>1-6</w:t>
+              <w:t>1</w:t>
             </w:r>
           </w:p>
           <w:p>
@@ -13118,7 +12906,7 @@
                 <w:b/>
                 <w:sz w:val="16"/>
               </w:rPr>
-              <w:t>1-6</w:t>
+              <w:t>2-6</w:t>
             </w:r>
           </w:p>
           <w:p>
@@ -13141,7 +12929,7 @@
                 <w:b/>
                 <w:sz w:val="16"/>
               </w:rPr>
-              <w:t>1-6</w:t>
+              <w:t>2-6</w:t>
             </w:r>
           </w:p>
           <w:p>
@@ -13164,7 +12952,7 @@
                 <w:b/>
                 <w:sz w:val="16"/>
               </w:rPr>
-              <w:t>1-6</w:t>
+              <w:t>2-6</w:t>
             </w:r>
           </w:p>
           <w:p>
@@ -14889,7 +14677,7 @@
                 <w:b/>
                 <w:sz w:val="16"/>
               </w:rPr>
-              <w:t>6-10</w:t>
+              <w:t>6</w:t>
             </w:r>
           </w:p>
           <w:p>
@@ -14920,7 +14708,7 @@
                 <w:b/>
                 <w:sz w:val="16"/>
               </w:rPr>
-              <w:t>6-10</w:t>
+              <w:t>6</w:t>
             </w:r>
           </w:p>
           <w:p>
@@ -14943,7 +14731,7 @@
                 <w:b/>
                 <w:sz w:val="16"/>
               </w:rPr>
-              <w:t>6-10</w:t>
+              <w:t>6</w:t>
             </w:r>
           </w:p>
           <w:p>
@@ -14968,7 +14756,7 @@
                 <w:b/>
                 <w:sz w:val="16"/>
               </w:rPr>
-              <w:t>6-10</w:t>
+              <w:t>7-10</w:t>
             </w:r>
           </w:p>
           <w:p>
@@ -14991,7 +14779,7 @@
                 <w:b/>
                 <w:sz w:val="16"/>
               </w:rPr>
-              <w:t>6-10</w:t>
+              <w:t>7-10</w:t>
             </w:r>
           </w:p>
           <w:p>
@@ -15014,7 +14802,7 @@
                 <w:b/>
                 <w:sz w:val="16"/>
               </w:rPr>
-              <w:t>6-10</w:t>
+              <w:t>7-10</w:t>
             </w:r>
           </w:p>
           <w:p>

</xml_diff>